<commit_message>
Update Arb translation words data for 2026-08-11 release
</commit_message>
<xml_diff>
--- a/ind/docx/004.content.docx
+++ b/ind/docx/004.content.docx
@@ -525,7 +525,7 @@
         <w:rPr>
           <w:lang w:val="id_ID" w:bidi="id_ID"/>
         </w:rPr>
-        <w:t>Cemar</w:t>
+        <w:t>Celaka</w:t>
       </w:r>
       <w:r>
         <w:rPr>
@@ -541,7 +541,7 @@
         <w:rPr>
           <w:lang w:val="id_ID" w:bidi="id_ID"/>
         </w:rPr>
-        <w:t>Definisi:</w:t>
+        <w:t>Pengertian:</w:t>
       </w:r>
     </w:p>
     <w:p>
@@ -555,7 +555,7 @@
         <w:rPr>
           <w:lang w:val="id_ID" w:bidi="id_ID"/>
         </w:rPr>
-        <w:t>Mencemari sesuatu berarti bertindak dengan cara yang mengotori, mencemarkan, atau tidak menghormati sesuatu yang suci.</w:t>
+        <w:t>Istilah "celaka" merujuk pada perasaan kesusahan yang mendalam. Ini juga memberikan peringatan bahwa seseorang akan menghadapi masalah serius.</w:t>
       </w:r>
     </w:p>
     <w:p>
@@ -573,7 +573,7 @@
         <w:rPr>
           <w:lang w:val="id_ID" w:bidi="id_ID"/>
         </w:rPr>
-        <w:t>Orang yang cemar adalah orang yang bertindak dengan cara yang tidak kudus dan tidak menghormati Allah.</w:t>
+        <w:t>Ungkapan "celakalah" diikuti dengan peringatan kepada orang-orang bahwa mereka akan mengalami penderitaan sebagai hukuman atas dosa-dosa mereka.</w:t>
       </w:r>
     </w:p>
     <w:p>
@@ -591,7 +591,7 @@
         <w:rPr>
           <w:lang w:val="id_ID" w:bidi="id_ID"/>
         </w:rPr>
-        <w:t>Kata kerja untuk "mencemarkan" dapat diterjemahkan dengan "memperlakukan sebagai tidak kudus" atau "bersikap tidak sopan" atau "tidak menghormati".</w:t>
+        <w:t>Di beberapa bagian dalam Alkitab, kata "celaka" diulang untuk menekankan penghakiman yang sangat mengerikan.</w:t>
       </w:r>
     </w:p>
     <w:p>
@@ -609,7 +609,18 @@
         <w:rPr>
           <w:lang w:val="id_ID" w:bidi="id_ID"/>
         </w:rPr>
-        <w:t>Allah mengatakan kepada bangsa Israel bahwa mereka telah "mencemarkan" diri mereka sendiri dengan berhala-berhala, yang berarti bahwa mereka telah membuat diri mereka sendiri menjadi "najis" atau "tidak terhormat" dengan dosa ini. Mereka juga tidak menghormati Allah.</w:t>
+        <w:t>Seseorang yang mengatakan "celakalah aku" atau "celakalah bagiku" sedang mengungkapkan kesedihan atas penderitaan yang mendalam.</w:t>
+      </w:r>
+    </w:p>
+    <w:p>
+      <w:pPr>
+        <w:pStyle w:val="Heading3"/>
+      </w:pPr>
+      <w:r>
+        <w:rPr>
+          <w:lang w:val="id_ID" w:bidi="id_ID"/>
+        </w:rPr>
+        <w:t>Saran Terjemahan:</w:t>
       </w:r>
     </w:p>
     <w:p>
@@ -627,68 +638,7 @@
         <w:rPr>
           <w:lang w:val="id_ID" w:bidi="id_ID"/>
         </w:rPr>
-        <w:t>Bergantung pada konteksnya, kata sifat "cemar" dapat diterjemahkan sebagai "tidak menghormati" atau "tidak bertuhan" atau "tidak kudus".</w:t>
-      </w:r>
-    </w:p>
-    <w:p>
-      <w:pPr/>
-      <w:r>
-        <w:rPr>
-          <w:lang w:val="id_ID" w:bidi="id_ID"/>
-        </w:rPr>
-      </w:r>
-      <w:r>
-        <w:rPr>
-          <w:lang w:val="id_ID" w:bidi="id_ID"/>
-        </w:rPr>
-        <w:t xml:space="preserve">(Lihat juga: </w:t>
-      </w:r>
-      <w:r>
-        <w:rPr>
-          <w:lang w:val="id_ID" w:bidi="id_ID"/>
-        </w:rPr>
-        <w:t>najis, menajiskan, mencemarkan</w:t>
-      </w:r>
-      <w:r>
-        <w:rPr>
-          <w:lang w:val="id_ID" w:bidi="id_ID"/>
-        </w:rPr>
-        <w:t xml:space="preserve">, </w:t>
-      </w:r>
-      <w:r>
-        <w:rPr>
-          <w:lang w:val="id_ID" w:bidi="id_ID"/>
-        </w:rPr>
-        <w:t>kudus, suci</w:t>
-      </w:r>
-      <w:r>
-        <w:rPr>
-          <w:lang w:val="id_ID" w:bidi="id_ID"/>
-        </w:rPr>
-        <w:t xml:space="preserve">, </w:t>
-      </w:r>
-      <w:r>
-        <w:rPr>
-          <w:lang w:val="id_ID" w:bidi="id_ID"/>
-        </w:rPr>
-        <w:t>bersih</w:t>
-      </w:r>
-      <w:r>
-        <w:rPr>
-          <w:lang w:val="id_ID" w:bidi="id_ID"/>
-        </w:rPr>
-        <w:t>)</w:t>
-      </w:r>
-    </w:p>
-    <w:p>
-      <w:pPr>
-        <w:pStyle w:val="Heading3"/>
-      </w:pPr>
-      <w:r>
-        <w:rPr>
-          <w:lang w:val="id_ID" w:bidi="id_ID"/>
-        </w:rPr>
-        <w:t>Referensi Alkitab:</w:t>
+        <w:t>Tergantung pada konteksnya, istilah "celaka" juga dapat diterjemahkan sebagai "kesedihan besar," "kesedihan," "malapetaka," atau "bencana."</w:t>
       </w:r>
     </w:p>
     <w:p>
@@ -702,7 +652,485 @@
           <w:lang w:val="id_ID" w:bidi="id_ID"/>
         </w:rPr>
       </w:r>
+      <w:r>
+        <w:rPr>
+          <w:lang w:val="id_ID" w:bidi="id_ID"/>
+        </w:rPr>
+        <w:t>Cara lain untuk menerjemahkan ungkapan "celakalah (nama kota)" antara lain dengan frasa, "Betapa mengerikannya bagi (nama kota)" atau "Orang-orang di (nama kota) akan menerima hukuman berat" atau "Penduduk (nama kota) akan sangat menderita."</w:t>
+      </w:r>
+    </w:p>
+    <w:p>
+      <w:pPr>
+        <w:pStyle w:val="ListBullet"/>
+        <w:spacing w:line="240" w:lineRule="auto"/>
+        <w:ind w:left="720"/>
+      </w:pPr>
+      <w:r>
+        <w:rPr>
+          <w:lang w:val="id_ID" w:bidi="id_ID"/>
+        </w:rPr>
+      </w:r>
+      <w:r>
+        <w:rPr>
+          <w:lang w:val="id_ID" w:bidi="id_ID"/>
+        </w:rPr>
+        <w:t>Ungkapan, "celakalah aku!" atau "celakalah bagiku!" dapat diterjemahkan sebagai "Betapa sedihnya aku!" atau "Aku sangat merana!" atau "Betapa mengerikannya ini bagiku!"</w:t>
+      </w:r>
+    </w:p>
+    <w:p>
+      <w:pPr>
+        <w:pStyle w:val="ListBullet"/>
+        <w:spacing w:line="240" w:lineRule="auto"/>
+        <w:ind w:left="720"/>
+      </w:pPr>
+      <w:r>
+        <w:rPr>
+          <w:lang w:val="id_ID" w:bidi="id_ID"/>
+        </w:rPr>
+      </w:r>
+      <w:r>
+        <w:rPr>
+          <w:lang w:val="id_ID" w:bidi="id_ID"/>
+        </w:rPr>
+        <w:t>Ungkapan "celakalah kamu" juga dapat diterjemahkan sebagai "Kamu akan sangat menderita" atau "Kamu akan mengalami kesulitan yang sangat mengerikan."</w:t>
+      </w:r>
+    </w:p>
+    <w:p>
+      <w:pPr>
+        <w:pStyle w:val="Heading3"/>
+      </w:pPr>
+      <w:r>
+        <w:rPr>
+          <w:lang w:val="id_ID" w:bidi="id_ID"/>
+        </w:rPr>
+        <w:t>Referensi Alkitab:</w:t>
+      </w:r>
+    </w:p>
+    <w:p>
+      <w:pPr>
+        <w:pStyle w:val="ListBullet"/>
+        <w:spacing w:line="240" w:lineRule="auto"/>
+        <w:ind w:left="720"/>
+      </w:pPr>
+      <w:r>
+        <w:rPr>
+          <w:lang w:val="id_ID" w:bidi="id_ID"/>
+        </w:rPr>
+      </w:r>
       <w:hyperlink r:id="rId18">
+        <w:r>
+          <w:rPr>
+            <w:lang w:val="id_ID" w:bidi="id_ID"/>
+          </w:rPr>
+          <w:rPr>
+            <w:color w:val="0000EE"/>
+            <w:u w:val="single"/>
+          </w:rPr>
+          <w:t>Yehezkiel 13:17–18</w:t>
+        </w:r>
+      </w:hyperlink>
+    </w:p>
+    <w:p>
+      <w:pPr>
+        <w:pStyle w:val="ListBullet"/>
+        <w:spacing w:line="240" w:lineRule="auto"/>
+        <w:ind w:left="720"/>
+      </w:pPr>
+      <w:r>
+        <w:rPr>
+          <w:lang w:val="id_ID" w:bidi="id_ID"/>
+        </w:rPr>
+      </w:r>
+      <w:hyperlink r:id="rId19">
+        <w:r>
+          <w:rPr>
+            <w:lang w:val="id_ID" w:bidi="id_ID"/>
+          </w:rPr>
+          <w:rPr>
+            <w:color w:val="0000EE"/>
+            <w:u w:val="single"/>
+          </w:rPr>
+          <w:t>Habakuk 2:12</w:t>
+        </w:r>
+      </w:hyperlink>
+    </w:p>
+    <w:p>
+      <w:pPr>
+        <w:pStyle w:val="ListBullet"/>
+        <w:spacing w:line="240" w:lineRule="auto"/>
+        <w:ind w:left="720"/>
+      </w:pPr>
+      <w:r>
+        <w:rPr>
+          <w:lang w:val="id_ID" w:bidi="id_ID"/>
+        </w:rPr>
+      </w:r>
+      <w:hyperlink r:id="rId20">
+        <w:r>
+          <w:rPr>
+            <w:lang w:val="id_ID" w:bidi="id_ID"/>
+          </w:rPr>
+          <w:rPr>
+            <w:color w:val="0000EE"/>
+            <w:u w:val="single"/>
+          </w:rPr>
+          <w:t>Yesaya 31:1–2</w:t>
+        </w:r>
+      </w:hyperlink>
+    </w:p>
+    <w:p>
+      <w:pPr>
+        <w:pStyle w:val="ListBullet"/>
+        <w:spacing w:line="240" w:lineRule="auto"/>
+        <w:ind w:left="720"/>
+      </w:pPr>
+      <w:r>
+        <w:rPr>
+          <w:lang w:val="id_ID" w:bidi="id_ID"/>
+        </w:rPr>
+      </w:r>
+      <w:hyperlink r:id="rId21">
+        <w:r>
+          <w:rPr>
+            <w:lang w:val="id_ID" w:bidi="id_ID"/>
+          </w:rPr>
+          <w:rPr>
+            <w:color w:val="0000EE"/>
+            <w:u w:val="single"/>
+          </w:rPr>
+          <w:t>Yeremia 45:1–3</w:t>
+        </w:r>
+      </w:hyperlink>
+    </w:p>
+    <w:p>
+      <w:pPr>
+        <w:pStyle w:val="ListBullet"/>
+        <w:spacing w:line="240" w:lineRule="auto"/>
+        <w:ind w:left="720"/>
+      </w:pPr>
+      <w:r>
+        <w:rPr>
+          <w:lang w:val="id_ID" w:bidi="id_ID"/>
+        </w:rPr>
+      </w:r>
+      <w:hyperlink r:id="rId22">
+        <w:r>
+          <w:rPr>
+            <w:lang w:val="id_ID" w:bidi="id_ID"/>
+          </w:rPr>
+          <w:rPr>
+            <w:color w:val="0000EE"/>
+            <w:u w:val="single"/>
+          </w:rPr>
+          <w:t>Yudas 1:9–11</w:t>
+        </w:r>
+      </w:hyperlink>
+    </w:p>
+    <w:p>
+      <w:pPr>
+        <w:pStyle w:val="ListBullet"/>
+        <w:spacing w:line="240" w:lineRule="auto"/>
+        <w:ind w:left="720"/>
+      </w:pPr>
+      <w:r>
+        <w:rPr>
+          <w:lang w:val="id_ID" w:bidi="id_ID"/>
+        </w:rPr>
+      </w:r>
+      <w:hyperlink r:id="rId23">
+        <w:r>
+          <w:rPr>
+            <w:lang w:val="id_ID" w:bidi="id_ID"/>
+          </w:rPr>
+          <w:rPr>
+            <w:color w:val="0000EE"/>
+            <w:u w:val="single"/>
+          </w:rPr>
+          <w:t>Lukas 6:24</w:t>
+        </w:r>
+      </w:hyperlink>
+    </w:p>
+    <w:p>
+      <w:pPr>
+        <w:pStyle w:val="ListBullet"/>
+        <w:spacing w:line="240" w:lineRule="auto"/>
+        <w:ind w:left="720"/>
+      </w:pPr>
+      <w:r>
+        <w:rPr>
+          <w:lang w:val="id_ID" w:bidi="id_ID"/>
+        </w:rPr>
+      </w:r>
+      <w:hyperlink r:id="rId24">
+        <w:r>
+          <w:rPr>
+            <w:lang w:val="id_ID" w:bidi="id_ID"/>
+          </w:rPr>
+          <w:rPr>
+            <w:color w:val="0000EE"/>
+            <w:u w:val="single"/>
+          </w:rPr>
+          <w:t>Lukas 17:1–2</w:t>
+        </w:r>
+      </w:hyperlink>
+    </w:p>
+    <w:p>
+      <w:pPr>
+        <w:pStyle w:val="ListBullet"/>
+        <w:spacing w:line="240" w:lineRule="auto"/>
+        <w:ind w:left="720"/>
+      </w:pPr>
+      <w:r>
+        <w:rPr>
+          <w:lang w:val="id_ID" w:bidi="id_ID"/>
+        </w:rPr>
+      </w:r>
+      <w:hyperlink r:id="rId25">
+        <w:r>
+          <w:rPr>
+            <w:lang w:val="id_ID" w:bidi="id_ID"/>
+          </w:rPr>
+          <w:rPr>
+            <w:color w:val="0000EE"/>
+            <w:u w:val="single"/>
+          </w:rPr>
+          <w:t>Matius 23:23</w:t>
+        </w:r>
+      </w:hyperlink>
+    </w:p>
+    <w:p>
+      <w:pPr>
+        <w:pStyle w:val="Heading3"/>
+      </w:pPr>
+      <w:r>
+        <w:rPr>
+          <w:lang w:val="id_ID" w:bidi="id_ID"/>
+        </w:rPr>
+        <w:t>Data Kata:</w:t>
+      </w:r>
+    </w:p>
+    <w:p>
+      <w:pPr>
+        <w:pStyle w:val="ListBullet"/>
+        <w:spacing w:line="240" w:lineRule="auto"/>
+        <w:ind w:left="720"/>
+      </w:pPr>
+      <w:r>
+        <w:rPr>
+          <w:lang w:val="id_ID" w:bidi="id_ID"/>
+        </w:rPr>
+      </w:r>
+      <w:r>
+        <w:rPr>
+          <w:lang w:val="id_ID" w:bidi="id_ID"/>
+        </w:rPr>
+        <w:t>Strong: H0188, H0190, H0337, H0480, H1929, H1945, H1958, G37590</w:t>
+      </w:r>
+      <w:r>
+        <w:rPr>
+          <w:lang w:val="id_ID" w:bidi="id_ID"/>
+        </w:rPr>
+      </w:r>
+      <w:r>
+        <w:rPr>
+          <w:lang w:val="id_ID" w:bidi="id_ID"/>
+        </w:rPr>
+      </w:r>
+    </w:p>
+    <w:p>
+      <w:pPr/>
+      <w:r>
+        <w:rPr>
+          <w:lang w:val="id_ID" w:bidi="id_ID"/>
+        </w:rPr>
+      </w:r>
+    </w:p>
+    <w:p>
+      <w:pPr>
+        <w:pStyle w:val="Heading2"/>
+      </w:pPr>
+      <w:r>
+        <w:rPr>
+          <w:lang w:val="id_ID" w:bidi="id_ID"/>
+        </w:rPr>
+        <w:t>Cemar</w:t>
+      </w:r>
+      <w:r>
+        <w:rPr>
+          <w:lang w:val="id_ID" w:bidi="id_ID"/>
+        </w:rPr>
+      </w:r>
+    </w:p>
+    <w:p>
+      <w:pPr>
+        <w:pStyle w:val="Heading3"/>
+      </w:pPr>
+      <w:r>
+        <w:rPr>
+          <w:lang w:val="id_ID" w:bidi="id_ID"/>
+        </w:rPr>
+        <w:t>Definisi:</w:t>
+      </w:r>
+    </w:p>
+    <w:p>
+      <w:pPr/>
+      <w:r>
+        <w:rPr>
+          <w:lang w:val="id_ID" w:bidi="id_ID"/>
+        </w:rPr>
+      </w:r>
+      <w:r>
+        <w:rPr>
+          <w:lang w:val="id_ID" w:bidi="id_ID"/>
+        </w:rPr>
+        <w:t>Mencemari sesuatu berarti bertindak dengan cara yang mengotori, mencemarkan, atau tidak menghormati sesuatu yang suci.</w:t>
+      </w:r>
+    </w:p>
+    <w:p>
+      <w:pPr>
+        <w:pStyle w:val="ListBullet"/>
+        <w:spacing w:line="240" w:lineRule="auto"/>
+        <w:ind w:left="720"/>
+      </w:pPr>
+      <w:r>
+        <w:rPr>
+          <w:lang w:val="id_ID" w:bidi="id_ID"/>
+        </w:rPr>
+      </w:r>
+      <w:r>
+        <w:rPr>
+          <w:lang w:val="id_ID" w:bidi="id_ID"/>
+        </w:rPr>
+        <w:t>Orang yang cemar adalah orang yang bertindak dengan cara yang tidak kudus dan tidak menghormati Allah.</w:t>
+      </w:r>
+    </w:p>
+    <w:p>
+      <w:pPr>
+        <w:pStyle w:val="ListBullet"/>
+        <w:spacing w:line="240" w:lineRule="auto"/>
+        <w:ind w:left="720"/>
+      </w:pPr>
+      <w:r>
+        <w:rPr>
+          <w:lang w:val="id_ID" w:bidi="id_ID"/>
+        </w:rPr>
+      </w:r>
+      <w:r>
+        <w:rPr>
+          <w:lang w:val="id_ID" w:bidi="id_ID"/>
+        </w:rPr>
+        <w:t>Kata kerja untuk "mencemarkan" dapat diterjemahkan dengan "memperlakukan sebagai tidak kudus" atau "bersikap tidak sopan" atau "tidak menghormati".</w:t>
+      </w:r>
+    </w:p>
+    <w:p>
+      <w:pPr>
+        <w:pStyle w:val="ListBullet"/>
+        <w:spacing w:line="240" w:lineRule="auto"/>
+        <w:ind w:left="720"/>
+      </w:pPr>
+      <w:r>
+        <w:rPr>
+          <w:lang w:val="id_ID" w:bidi="id_ID"/>
+        </w:rPr>
+      </w:r>
+      <w:r>
+        <w:rPr>
+          <w:lang w:val="id_ID" w:bidi="id_ID"/>
+        </w:rPr>
+        <w:t>Allah mengatakan kepada bangsa Israel bahwa mereka telah "mencemarkan" diri mereka sendiri dengan berhala-berhala, yang berarti bahwa mereka telah membuat diri mereka sendiri menjadi "najis" atau "tidak terhormat" dengan dosa ini. Mereka juga tidak menghormati Allah.</w:t>
+      </w:r>
+    </w:p>
+    <w:p>
+      <w:pPr>
+        <w:pStyle w:val="ListBullet"/>
+        <w:spacing w:line="240" w:lineRule="auto"/>
+        <w:ind w:left="720"/>
+      </w:pPr>
+      <w:r>
+        <w:rPr>
+          <w:lang w:val="id_ID" w:bidi="id_ID"/>
+        </w:rPr>
+      </w:r>
+      <w:r>
+        <w:rPr>
+          <w:lang w:val="id_ID" w:bidi="id_ID"/>
+        </w:rPr>
+        <w:t>Bergantung pada konteksnya, kata sifat "cemar" dapat diterjemahkan sebagai "tidak menghormati" atau "tidak bertuhan" atau "tidak kudus".</w:t>
+      </w:r>
+    </w:p>
+    <w:p>
+      <w:pPr/>
+      <w:r>
+        <w:rPr>
+          <w:lang w:val="id_ID" w:bidi="id_ID"/>
+        </w:rPr>
+      </w:r>
+      <w:r>
+        <w:rPr>
+          <w:lang w:val="id_ID" w:bidi="id_ID"/>
+        </w:rPr>
+        <w:t xml:space="preserve">(Lihat juga: </w:t>
+      </w:r>
+      <w:r>
+        <w:rPr>
+          <w:lang w:val="id_ID" w:bidi="id_ID"/>
+        </w:rPr>
+        <w:t>najis, menajiskan, mencemarkan</w:t>
+      </w:r>
+      <w:r>
+        <w:rPr>
+          <w:lang w:val="id_ID" w:bidi="id_ID"/>
+        </w:rPr>
+        <w:t xml:space="preserve">, </w:t>
+      </w:r>
+      <w:r>
+        <w:rPr>
+          <w:lang w:val="id_ID" w:bidi="id_ID"/>
+        </w:rPr>
+        <w:t>kudus, suci</w:t>
+      </w:r>
+      <w:r>
+        <w:rPr>
+          <w:lang w:val="id_ID" w:bidi="id_ID"/>
+        </w:rPr>
+        <w:t xml:space="preserve">, </w:t>
+      </w:r>
+      <w:r>
+        <w:rPr>
+          <w:lang w:val="id_ID" w:bidi="id_ID"/>
+        </w:rPr>
+        <w:t>bersih</w:t>
+      </w:r>
+      <w:r>
+        <w:rPr>
+          <w:lang w:val="id_ID" w:bidi="id_ID"/>
+        </w:rPr>
+        <w:t>)</w:t>
+      </w:r>
+    </w:p>
+    <w:p>
+      <w:pPr>
+        <w:pStyle w:val="Heading3"/>
+      </w:pPr>
+      <w:r>
+        <w:rPr>
+          <w:lang w:val="id_ID" w:bidi="id_ID"/>
+        </w:rPr>
+        <w:t>Referensi Alkitab:</w:t>
+      </w:r>
+    </w:p>
+    <w:p>
+      <w:pPr>
+        <w:pStyle w:val="ListBullet"/>
+        <w:spacing w:line="240" w:lineRule="auto"/>
+        <w:ind w:left="720"/>
+      </w:pPr>
+      <w:r>
+        <w:rPr>
+          <w:lang w:val="id_ID" w:bidi="id_ID"/>
+        </w:rPr>
+      </w:r>
+      <w:hyperlink r:id="rId26">
         <w:r>
           <w:rPr>
             <w:lang w:val="id_ID" w:bidi="id_ID"/>
@@ -726,7 +1154,7 @@
           <w:lang w:val="id_ID" w:bidi="id_ID"/>
         </w:rPr>
       </w:r>
-      <w:hyperlink r:id="rId19">
+      <w:hyperlink r:id="rId27">
         <w:r>
           <w:rPr>
             <w:lang w:val="id_ID" w:bidi="id_ID"/>
@@ -750,7 +1178,7 @@
           <w:lang w:val="id_ID" w:bidi="id_ID"/>
         </w:rPr>
       </w:r>
-      <w:hyperlink r:id="rId20">
+      <w:hyperlink r:id="rId28">
         <w:r>
           <w:rPr>
             <w:lang w:val="id_ID" w:bidi="id_ID"/>
@@ -774,7 +1202,7 @@
           <w:lang w:val="id_ID" w:bidi="id_ID"/>
         </w:rPr>
       </w:r>
-      <w:hyperlink r:id="rId21">
+      <w:hyperlink r:id="rId29">
         <w:r>
           <w:rPr>
             <w:lang w:val="id_ID" w:bidi="id_ID"/>
@@ -798,7 +1226,7 @@
           <w:lang w:val="id_ID" w:bidi="id_ID"/>
         </w:rPr>
       </w:r>
-      <w:hyperlink r:id="rId22">
+      <w:hyperlink r:id="rId30">
         <w:r>
           <w:rPr>
             <w:lang w:val="id_ID" w:bidi="id_ID"/>
@@ -1027,7 +1455,7 @@
           <w:lang w:val="id_ID" w:bidi="id_ID"/>
         </w:rPr>
       </w:r>
-      <w:hyperlink r:id="rId23">
+      <w:hyperlink r:id="rId31">
         <w:r>
           <w:rPr>
             <w:lang w:val="id_ID" w:bidi="id_ID"/>
@@ -1051,7 +1479,7 @@
           <w:lang w:val="id_ID" w:bidi="id_ID"/>
         </w:rPr>
       </w:r>
-      <w:hyperlink r:id="rId24">
+      <w:hyperlink r:id="rId32">
         <w:r>
           <w:rPr>
             <w:lang w:val="id_ID" w:bidi="id_ID"/>
@@ -1075,7 +1503,7 @@
           <w:lang w:val="id_ID" w:bidi="id_ID"/>
         </w:rPr>
       </w:r>
-      <w:hyperlink r:id="rId25">
+      <w:hyperlink r:id="rId33">
         <w:r>
           <w:rPr>
             <w:lang w:val="id_ID" w:bidi="id_ID"/>
@@ -1099,7 +1527,7 @@
           <w:lang w:val="id_ID" w:bidi="id_ID"/>
         </w:rPr>
       </w:r>
-      <w:hyperlink r:id="rId26">
+      <w:hyperlink r:id="rId34">
         <w:r>
           <w:rPr>
             <w:lang w:val="id_ID" w:bidi="id_ID"/>
@@ -1123,7 +1551,7 @@
           <w:lang w:val="id_ID" w:bidi="id_ID"/>
         </w:rPr>
       </w:r>
-      <w:hyperlink r:id="rId27">
+      <w:hyperlink r:id="rId35">
         <w:r>
           <w:rPr>
             <w:lang w:val="id_ID" w:bidi="id_ID"/>
@@ -1443,6 +1871,159 @@
           <w:lang w:val="id_ID" w:bidi="id_ID"/>
         </w:rPr>
         <w:t>Strong’s:</w:t>
+      </w:r>
+      <w:r>
+        <w:rPr>
+          <w:lang w:val="id_ID" w:bidi="id_ID"/>
+        </w:rPr>
+      </w:r>
+      <w:r>
+        <w:rPr>
+          <w:lang w:val="id_ID" w:bidi="id_ID"/>
+        </w:rPr>
+      </w:r>
+    </w:p>
+    <w:p>
+      <w:pPr/>
+      <w:r>
+        <w:rPr>
+          <w:lang w:val="id_ID" w:bidi="id_ID"/>
+        </w:rPr>
+      </w:r>
+    </w:p>
+    <w:p>
+      <w:pPr>
+        <w:pStyle w:val="Heading2"/>
+      </w:pPr>
+      <w:r>
+        <w:rPr>
+          <w:lang w:val="id_ID" w:bidi="id_ID"/>
+        </w:rPr>
+        <w:t>Cerdik</w:t>
+      </w:r>
+      <w:r>
+        <w:rPr>
+          <w:lang w:val="id_ID" w:bidi="id_ID"/>
+        </w:rPr>
+      </w:r>
+    </w:p>
+    <w:p>
+      <w:pPr>
+        <w:pStyle w:val="Heading3"/>
+      </w:pPr>
+      <w:r>
+        <w:rPr>
+          <w:lang w:val="id_ID" w:bidi="id_ID"/>
+        </w:rPr>
+        <w:t>Pengertian:</w:t>
+      </w:r>
+    </w:p>
+    <w:p>
+      <w:pPr/>
+      <w:r>
+        <w:rPr>
+          <w:lang w:val="id_ID" w:bidi="id_ID"/>
+        </w:rPr>
+      </w:r>
+      <w:r>
+        <w:rPr>
+          <w:lang w:val="id_ID" w:bidi="id_ID"/>
+        </w:rPr>
+        <w:t>Istilah "cerdik" menggambarkan seseorang yang cerdas dan pintar, terutama dalam hal-hal praktis.</w:t>
+      </w:r>
+    </w:p>
+    <w:p>
+      <w:pPr>
+        <w:pStyle w:val="ListBullet"/>
+        <w:spacing w:line="240" w:lineRule="auto"/>
+        <w:ind w:left="720"/>
+      </w:pPr>
+      <w:r>
+        <w:rPr>
+          <w:lang w:val="id_ID" w:bidi="id_ID"/>
+        </w:rPr>
+      </w:r>
+      <w:r>
+        <w:rPr>
+          <w:lang w:val="id_ID" w:bidi="id_ID"/>
+        </w:rPr>
+        <w:t>Biasanya, istilah "cerdik" memiliki konotasi yang agak bernada negatif negatif karena sering kali melibatkan sifat egois.</w:t>
+      </w:r>
+    </w:p>
+    <w:p>
+      <w:pPr>
+        <w:pStyle w:val="ListBullet"/>
+        <w:spacing w:line="240" w:lineRule="auto"/>
+        <w:ind w:left="720"/>
+      </w:pPr>
+      <w:r>
+        <w:rPr>
+          <w:lang w:val="id_ID" w:bidi="id_ID"/>
+        </w:rPr>
+      </w:r>
+      <w:r>
+        <w:rPr>
+          <w:lang w:val="id_ID" w:bidi="id_ID"/>
+        </w:rPr>
+        <w:t>Orang yang cerdik biasanya lebih fokus menguntungkan dirinya sendiri daripada orang lain.</w:t>
+      </w:r>
+    </w:p>
+    <w:p>
+      <w:pPr>
+        <w:pStyle w:val="ListBullet"/>
+        <w:spacing w:line="240" w:lineRule="auto"/>
+        <w:ind w:left="720"/>
+      </w:pPr>
+      <w:r>
+        <w:rPr>
+          <w:lang w:val="id_ID" w:bidi="id_ID"/>
+        </w:rPr>
+      </w:r>
+      <w:r>
+        <w:rPr>
+          <w:lang w:val="id_ID" w:bidi="id_ID"/>
+        </w:rPr>
+        <w:t>Cara lain untuk menerjemahkan istilah ini dapat mencakup "licik," "cerdik," "lihai," atau "pandai," tergantung pada konteksnya.</w:t>
+      </w:r>
+    </w:p>
+    <w:p>
+      <w:pPr>
+        <w:pStyle w:val="Heading3"/>
+      </w:pPr>
+      <w:r>
+        <w:rPr>
+          <w:lang w:val="id_ID" w:bidi="id_ID"/>
+        </w:rPr>
+        <w:t>Referensi dari Alkitab:</w:t>
+      </w:r>
+    </w:p>
+    <w:p>
+      <w:pPr>
+        <w:pStyle w:val="Heading3"/>
+      </w:pPr>
+      <w:r>
+        <w:rPr>
+          <w:lang w:val="id_ID" w:bidi="id_ID"/>
+        </w:rPr>
+        <w:t>Data Kata:</w:t>
+      </w:r>
+    </w:p>
+    <w:p>
+      <w:pPr>
+        <w:pStyle w:val="ListBullet"/>
+        <w:spacing w:line="240" w:lineRule="auto"/>
+        <w:ind w:left="720"/>
+      </w:pPr>
+      <w:r>
+        <w:rPr>
+          <w:lang w:val="id_ID" w:bidi="id_ID"/>
+        </w:rPr>
+      </w:r>
+      <w:r>
+        <w:rPr>
+          <w:lang w:val="id_ID" w:bidi="id_ID"/>
+        </w:rPr>
+        <w:t>Strong: H2450, H6175, G54290</w:t>
       </w:r>
       <w:r>
         <w:rPr>

</xml_diff>